<commit_message>
Update World Cup Business Coach report
</commit_message>
<xml_diff>
--- a/public/artifacts/world-cup-business-coach-report.docx
+++ b/public/artifacts/world-cup-business-coach-report.docx
@@ -216,7 +216,7 @@
           <w:szCs w:val="28"/>
           <w:rtl w:val="0"/>
         </w:rPr>
-        <w:t xml:space="preserve">Artificial Intelligence has become an indispensable tool for addressing real world problems and enhancing learning, communication and decision making. Gen AI tools such as LLMs assist users by generating content, answering questions and supporting problem solving. This AI Lab provided me with the opportunity to explore these technologies while learning how to develop an AI-based solution using the design thinking process.</w:t>
+        <w:t xml:space="preserve">Artificial Intelligence has become an essential tool for handling real world problems and improving learning, communication and decision making. Gen AI tools such as Large Language Models aid users by generating content, answering questions and supporting problem solving. This AI Lab provided me with the opportunity to explore these technologies while learning how to develop an AI-based solution using the design thinking process.</w:t>
       </w:r>
     </w:p>
     <w:p>
@@ -505,21 +505,22 @@
     </w:p>
     <w:p>
       <w:pPr>
-        <w:jc w:val="both"/>
-        <w:rPr>
-          <w:rFonts w:ascii="Calibri" w:cs="Calibri" w:eastAsia="Calibri" w:hAnsi="Calibri"/>
-          <w:sz w:val="28"/>
-          <w:szCs w:val="28"/>
-        </w:rPr>
-      </w:pPr>
-      <w:r>
-        <w:rPr>
-          <w:rFonts w:ascii="Calibri" w:cs="Calibri" w:eastAsia="Calibri" w:hAnsi="Calibri"/>
-          <w:sz w:val="28"/>
-          <w:szCs w:val="28"/>
-          <w:rtl w:val="0"/>
-        </w:rPr>
-        <w:t xml:space="preserve">For this activity, I used ChatGPT to check how a large language model responds to the same prompt in three separate conversations. The purpose of this activity was to compare the responses and to understand whether the model provided consistent results when the same instructions were given multiple times. I evaluated the outputs based on clarity, relevance, completeness and how well each response followed the prompt.</w:t>
+        <w:spacing w:after="240" w:before="240" w:lineRule="auto"/>
+        <w:jc w:val="both"/>
+        <w:rPr>
+          <w:rFonts w:ascii="Calibri" w:cs="Calibri" w:eastAsia="Calibri" w:hAnsi="Calibri"/>
+          <w:sz w:val="28"/>
+          <w:szCs w:val="28"/>
+        </w:rPr>
+      </w:pPr>
+      <w:r>
+        <w:rPr>
+          <w:rFonts w:ascii="Calibri" w:cs="Calibri" w:eastAsia="Calibri" w:hAnsi="Calibri"/>
+          <w:sz w:val="28"/>
+          <w:szCs w:val="28"/>
+          <w:rtl w:val="0"/>
+        </w:rPr>
+        <w:t xml:space="preserve">For this activity, I used ChatGPT to observe how a large language model responds to the same prompt in three separate conversations. The main purpose was to compare the generated responses and determine whether the LLM produced consistent results when given the same prompt multiple times. I evaluated the responses based on criteria such as clarity, relevance, completeness, and how well each one followed the prompt.</w:t>
       </w:r>
     </w:p>
     <w:p>
@@ -3430,22 +3431,23 @@
     </w:p>
     <w:p>
       <w:pPr>
-        <w:ind w:left="0" w:firstLine="720"/>
-        <w:jc w:val="both"/>
-        <w:rPr>
-          <w:rFonts w:ascii="Calibri" w:cs="Calibri" w:eastAsia="Calibri" w:hAnsi="Calibri"/>
-          <w:sz w:val="28"/>
-          <w:szCs w:val="28"/>
-        </w:rPr>
-      </w:pPr>
-      <w:r>
-        <w:rPr>
-          <w:rFonts w:ascii="Calibri" w:cs="Calibri" w:eastAsia="Calibri" w:hAnsi="Calibri"/>
-          <w:sz w:val="28"/>
-          <w:szCs w:val="28"/>
-          <w:rtl w:val="0"/>
-        </w:rPr>
-        <w:t xml:space="preserve">The main users of my AI assistant are children between the ages of 10 and 15 who enjoy the FIFA World Cup but may not know much about business. Although many children like watching football, they may not understand how sponsorships, advertising, tourism, broadcasting rights, ticket sales, and merchandise support the tournament. The assistant will use simple explanations and familiar examples to help them understand these business concepts.</w:t>
+        <w:spacing w:after="240" w:before="240" w:lineRule="auto"/>
+        <w:ind w:firstLine="720"/>
+        <w:jc w:val="both"/>
+        <w:rPr>
+          <w:rFonts w:ascii="Calibri" w:cs="Calibri" w:eastAsia="Calibri" w:hAnsi="Calibri"/>
+          <w:sz w:val="28"/>
+          <w:szCs w:val="28"/>
+        </w:rPr>
+      </w:pPr>
+      <w:r>
+        <w:rPr>
+          <w:rFonts w:ascii="Calibri" w:cs="Calibri" w:eastAsia="Calibri" w:hAnsi="Calibri"/>
+          <w:sz w:val="28"/>
+          <w:szCs w:val="28"/>
+          <w:rtl w:val="0"/>
+        </w:rPr>
+        <w:t xml:space="preserve">The majority of the users of the AI assistant are children aged 10–15 who enjoy the FIFA World Cup but have limited knowledge of business. Although many children are familiar with football, they may not know how sponsorships, advertising, tourism, broadcasting rights, ticket sales, and merchandise contribute to the tournament. This assistant will provide simple explanations and relatable examples to make these business ideas easier to understand.</w:t>
       </w:r>
     </w:p>
     <w:p>
@@ -3524,6 +3526,63 @@
       </w:pPr>
       <w:r>
         <w:rPr>
+          <w:rtl w:val="0"/>
+        </w:rPr>
+      </w:r>
+    </w:p>
+    <w:p>
+      <w:pPr>
+        <w:spacing w:after="240" w:before="240" w:lineRule="auto"/>
+        <w:ind w:left="0" w:firstLine="0"/>
+        <w:jc w:val="both"/>
+        <w:rPr>
+          <w:rFonts w:ascii="Calibri" w:cs="Calibri" w:eastAsia="Calibri" w:hAnsi="Calibri"/>
+          <w:b w:val="1"/>
+          <w:bCs w:val="1"/>
+          <w:sz w:val="28"/>
+          <w:szCs w:val="28"/>
+        </w:rPr>
+      </w:pPr>
+      <w:r>
+        <w:rPr>
+          <w:rtl w:val="0"/>
+        </w:rPr>
+      </w:r>
+    </w:p>
+    <w:p>
+      <w:pPr>
+        <w:spacing w:after="240" w:before="240" w:lineRule="auto"/>
+        <w:ind w:left="0" w:firstLine="0"/>
+        <w:jc w:val="both"/>
+        <w:rPr>
+          <w:rFonts w:ascii="Calibri" w:cs="Calibri" w:eastAsia="Calibri" w:hAnsi="Calibri"/>
+          <w:b w:val="1"/>
+          <w:bCs w:val="1"/>
+          <w:sz w:val="28"/>
+          <w:szCs w:val="28"/>
+        </w:rPr>
+      </w:pPr>
+      <w:r>
+        <w:rPr>
+          <w:rtl w:val="0"/>
+        </w:rPr>
+      </w:r>
+    </w:p>
+    <w:p>
+      <w:pPr>
+        <w:spacing w:after="240" w:before="240" w:lineRule="auto"/>
+        <w:ind w:left="0" w:firstLine="0"/>
+        <w:jc w:val="both"/>
+        <w:rPr>
+          <w:rFonts w:ascii="Calibri" w:cs="Calibri" w:eastAsia="Calibri" w:hAnsi="Calibri"/>
+          <w:b w:val="1"/>
+          <w:bCs w:val="1"/>
+          <w:sz w:val="28"/>
+          <w:szCs w:val="28"/>
+        </w:rPr>
+      </w:pPr>
+      <w:r>
+        <w:rPr>
           <w:rFonts w:ascii="Calibri" w:cs="Calibri" w:eastAsia="Calibri" w:hAnsi="Calibri"/>
           <w:b w:val="1"/>
           <w:bCs w:val="1"/>
@@ -3552,18 +3611,18 @@
           <w:szCs w:val="28"/>
           <w:rtl w:val="0"/>
         </w:rPr>
-        <w:t xml:space="preserve">My idea was to create </w:t>
-      </w:r>
-      <w:r>
-        <w:rPr>
-          <w:rFonts w:ascii="Calibri" w:cs="Calibri" w:eastAsia="Calibri" w:hAnsi="Calibri"/>
-          <w:b w:val="1"/>
-          <w:bCs w:val="1"/>
-          <w:sz w:val="28"/>
-          <w:szCs w:val="28"/>
-          <w:rtl w:val="0"/>
-        </w:rPr>
-        <w:t xml:space="preserve">World Cup Business Coach</w:t>
+        <w:t xml:space="preserve">My idea was to create a World</w:t>
+      </w:r>
+      <w:r>
+        <w:rPr>
+          <w:rFonts w:ascii="Calibri" w:cs="Calibri" w:eastAsia="Calibri" w:hAnsi="Calibri"/>
+          <w:b w:val="1"/>
+          <w:bCs w:val="1"/>
+          <w:sz w:val="28"/>
+          <w:szCs w:val="28"/>
+          <w:rtl w:val="0"/>
+        </w:rPr>
+        <w:t xml:space="preserve"> Cup Business Coach</w:t>
       </w:r>
       <w:r>
         <w:rPr>
@@ -3927,7 +3986,7 @@
           <w:szCs w:val="28"/>
           <w:rtl w:val="0"/>
         </w:rPr>
-        <w:t xml:space="preserve">Includes real-world FIFA World Cup examples.</w:t>
+        <w:t xml:space="preserve">Uses practical examples from the FIFA World Cup.</w:t>
       </w:r>
     </w:p>
     <w:p>
@@ -3951,7 +4010,7 @@
           <w:szCs w:val="28"/>
           <w:rtl w:val="0"/>
         </w:rPr>
-        <w:t xml:space="preserve">Covers sponsorships, advertising, ticket sales, tourism, broadcasting rights, and merchandise.</w:t>
+        <w:t xml:space="preserve">Explains key business areas such as sponsorships, advertising, ticket sales, tourism, broadcasting rights, and merchandise.</w:t>
       </w:r>
     </w:p>
     <w:p>
@@ -3975,7 +4034,7 @@
           <w:szCs w:val="28"/>
           <w:rtl w:val="0"/>
         </w:rPr>
-        <w:t xml:space="preserve">Answers follow-up questions and adjusts explanations when needed.</w:t>
+        <w:t xml:space="preserve">Responds to additional questions and adapts the explanation when necessary.</w:t>
       </w:r>
     </w:p>
     <w:p>
@@ -3999,23 +4058,7 @@
           <w:szCs w:val="28"/>
           <w:rtl w:val="0"/>
         </w:rPr>
-        <w:t xml:space="preserve">Organizes responses with clear headings and sections.</w:t>
-      </w:r>
-    </w:p>
-    <w:p>
-      <w:pPr>
-        <w:spacing w:after="240" w:before="240" w:lineRule="auto"/>
-        <w:ind w:left="0" w:firstLine="0"/>
-        <w:rPr>
-          <w:rFonts w:ascii="Calibri" w:cs="Calibri" w:eastAsia="Calibri" w:hAnsi="Calibri"/>
-          <w:sz w:val="28"/>
-          <w:szCs w:val="28"/>
-        </w:rPr>
-      </w:pPr>
-      <w:r>
-        <w:rPr>
-          <w:rtl w:val="0"/>
-        </w:rPr>
+        <w:t xml:space="preserve">Structures responses using easy-to-follow headings and sections.</w:t>
       </w:r>
     </w:p>
     <w:p>

</xml_diff>